<commit_message>
Enforce read-only policy for ended plants
Add the C12 migration and application guards to prevent editing ended plants or changing propagation-origin dates. Correct active-plant event date validation and time preservation, with SQL/HTTP coverage and updated deployment guidance.
</commit_message>
<xml_diff>
--- a/docs/user-guides/linux/02-AddAndManagePlantsInOrchidApp-LinuxPi.docx
+++ b/docs/user-guides/linux/02-AddAndManagePlantsInOrchidApp-LinuxPi.docx
@@ -562,7 +562,7 @@
           </w:tcPr>
           <w:p>
             <w:r>
-              <w:t>The parent is ended and new care actions are restricted. Children receive new permanent Plant Tags.</w:t>
+              <w:t>Ended plants are read-only: details, events and photos cannot be changed. History remains viewable. Children receive new permanent Plant Tags.</w:t>
             </w:r>
           </w:p>
         </w:tc>
@@ -2510,7 +2510,7 @@
     </w:p>
     <w:p>
       <w:r>
-        <w:t>The original plant is ended; new care actions are restricted.</w:t>
+        <w:t>The original plant becomes read-only. Its history and photos remain viewable.</w:t>
       </w:r>
     </w:p>
     <w:p>
@@ -2760,7 +2760,7 @@
     </w:p>
     <w:p>
       <w:r>
-        <w:t>The original plant is ended; its history remains available and new care actions are restricted.</w:t>
+        <w:t>Ended plants cannot be edited or reactivated. Their history and photos remain viewable.</w:t>
       </w:r>
     </w:p>
     <w:p>

</xml_diff>

<commit_message>
Enforce read-only policy for ended plants (#353)
Add the C12 migration and application guards to prevent editing ended plants or changing propagation-origin dates. Correct active-plant event date validation and time preservation, with SQL/HTTP coverage and updated deployment guidance.
</commit_message>
<xml_diff>
--- a/docs/user-guides/linux/02-AddAndManagePlantsInOrchidApp-LinuxPi.docx
+++ b/docs/user-guides/linux/02-AddAndManagePlantsInOrchidApp-LinuxPi.docx
@@ -562,7 +562,7 @@
           </w:tcPr>
           <w:p>
             <w:r>
-              <w:t>The parent is ended and new care actions are restricted. Children receive new permanent Plant Tags.</w:t>
+              <w:t>Ended plants are read-only: details, events and photos cannot be changed. History remains viewable. Children receive new permanent Plant Tags.</w:t>
             </w:r>
           </w:p>
         </w:tc>
@@ -2510,7 +2510,7 @@
     </w:p>
     <w:p>
       <w:r>
-        <w:t>The original plant is ended; new care actions are restricted.</w:t>
+        <w:t>The original plant becomes read-only. Its history and photos remain viewable.</w:t>
       </w:r>
     </w:p>
     <w:p>
@@ -2760,7 +2760,7 @@
     </w:p>
     <w:p>
       <w:r>
-        <w:t>The original plant is ended; its history remains available and new care actions are restricted.</w:t>
+        <w:t>Ended plants cannot be edited or reactivated. Their history and photos remain viewable.</w:t>
       </w:r>
     </w:p>
     <w:p>

</xml_diff>

<commit_message>
Add photo handling and recovery safeguards
Implement upright photo processing with private metadata stripping by default, paired photo/thumbnail writes, and recovery journals for uncertain database outcomes. Add readiness checks, make taxon updates preserve caller transactions, and document the migration, recovery procedure, and platform acceptance steps.
</commit_message>
<xml_diff>
--- a/docs/user-guides/linux/02-AddAndManagePlantsInOrchidApp-LinuxPi.docx
+++ b/docs/user-guides/linux/02-AddAndManagePlantsInOrchidApp-LinuxPi.docx
@@ -1401,7 +1401,7 @@
     </w:p>
     <w:p>
       <w:r>
-        <w:t>Photos are added through observations.</w:t>
+        <w:t>New photos are rotated upright; GPS and camera metadata are removed by default.</w:t>
       </w:r>
     </w:p>
     <w:p>
@@ -1685,7 +1685,7 @@
     </w:p>
     <w:p>
       <w:r>
-        <w:t>On the Photos page, you can upload more than one image at a time.</w:t>
+        <w:t>Upload several photos together. If one fails, the whole batch is cancelled.</w:t>
       </w:r>
     </w:p>
     <w:p>
@@ -2510,7 +2510,7 @@
     </w:p>
     <w:p>
       <w:r>
-        <w:t>Ended plants stay read-only. After a failed save, refresh history before retrying.</w:t>
+        <w:t>Ended plants stay read-only. Keep reported photo recovery files and contact support.</w:t>
       </w:r>
     </w:p>
     <w:p>

</xml_diff>

<commit_message>
Add photo handling and recovery safeguards (#356)
Implement upright photo processing with private metadata stripping by default, paired photo/thumbnail writes, and recovery journals for uncertain database outcomes. Add readiness checks, make taxon updates preserve caller transactions, and document the migration, recovery procedure, and platform acceptance steps.
</commit_message>
<xml_diff>
--- a/docs/user-guides/linux/02-AddAndManagePlantsInOrchidApp-LinuxPi.docx
+++ b/docs/user-guides/linux/02-AddAndManagePlantsInOrchidApp-LinuxPi.docx
@@ -1401,7 +1401,7 @@
     </w:p>
     <w:p>
       <w:r>
-        <w:t>Photos are added through observations.</w:t>
+        <w:t>New photos are rotated upright; GPS and camera metadata are removed by default.</w:t>
       </w:r>
     </w:p>
     <w:p>
@@ -1685,7 +1685,7 @@
     </w:p>
     <w:p>
       <w:r>
-        <w:t>On the Photos page, you can upload more than one image at a time.</w:t>
+        <w:t>Upload several photos together. If one fails, the whole batch is cancelled.</w:t>
       </w:r>
     </w:p>
     <w:p>
@@ -2510,7 +2510,7 @@
     </w:p>
     <w:p>
       <w:r>
-        <w:t>Ended plants stay read-only. After a failed save, refresh history before retrying.</w:t>
+        <w:t>Ended plants stay read-only. Keep reported photo recovery files and contact support.</w:t>
       </w:r>
     </w:p>
     <w:p>

</xml_diff>